<commit_message>
Corrige plazos ANCI (POL-11/PROC-05) y reconcilia mapeos, RTO/RPO y diagramas
- POL-SGSI-11 y PROC-SGSI-05: plazos Ley 21.663 corregidos a alerta temprana 3 h /
  actualización 72 h (24 h si OIV afecta un servicio esencial) / informe final
  15 días corridos. Antes decían 3/24/72 y omitían el informe final.
- Reconcilia "documentos relacionados/SoA" con el mapeo: POL-03 (+8.14),
  POL-10 (+5.14, 8.12, 8.33) y PROC-03 (8.8 -> 8.13).
- POL-03: alinea RTO/RPO con el BCP/DRP (GOB-SGSI-08); POL-14: "POL-01 a 14" -> "01 a 15".
- Evidencias de diagramas y 03-evidencias/README: agrega PROC-05/13/14 (canónicos)
  y aclara los diagramas de antecedente.
- Renombra 2 diagramas PNG con tildes mal codificadas (completa G-10).

Co-Authored-By: Claude Opus 4.8 (1M context) <noreply@anthropic.com>
</commit_message>
<xml_diff>
--- a/01-politicas/POL-SGSI-03 - Política de respaldo y recuperación.docx
+++ b/01-politicas/POL-SGSI-03 - Política de respaldo y recuperación.docx
@@ -2284,7 +2284,7 @@
           <w:szCs w:val="22"/>
           <w:lang w:val="en-US"/>
         </w:rPr>
-        <w:t>Los objetivos mínimos para sistemas críticos serán: RTO de 4 horas y RPO de 24 horas.</w:t>
+        <w:t>Los objetivos mínimos para sistemas críticos serán: RTO de 4 horas y RPO de 24 horas. Los sistemas más críticos (base de datos de clientes, portal y ERP) tienen objetivos más estrictos definidos por sistema en el Plan de Continuidad del Negocio (GOB-SGSI-08), con RPO de 1 a 4 horas.</w:t>
       </w:r>
     </w:p>
     <w:p>
@@ -2448,7 +2448,7 @@
           <w:szCs w:val="22"/>
           <w:lang w:val="en-US"/>
         </w:rPr>
-        <w:t>SoA – control 8.13; Matriz de riesgos (R-02, R-10, R-11); Plan de continuidad del negocio; Procedimiento de restauración de servicios críticos.</w:t>
+        <w:t>SoA – controles 8.13, 8.14; Matriz de riesgos (R-02, R-10, R-11); Plan de continuidad del negocio; Procedimiento de restauración de servicios críticos.</w:t>
       </w:r>
     </w:p>
     <w:p>

</xml_diff>